<commit_message>
ajustes e manual de usuario
</commit_message>
<xml_diff>
--- a/onboarding_cliente.docx
+++ b/onboarding_cliente.docx
@@ -7,12 +7,12 @@
         <w:pStyle w:val="Title"/>
       </w:pPr>
       <w:r>
-        <w:t>Guia de Configuracao - Bot de Atendimento WhatsApp</w:t>
+        <w:t>Guia de Configuração — Bot de Atendimento WhatsApp</w:t>
       </w:r>
     </w:p>
     <w:p>
       <w:r>
-        <w:t>Este documento orienta voce a configurar as contas e gerar as credenciais necessarias para o funcionamento do bot. Siga cada etapa na ordem indicada e envie os dados ao seu desenvolvedor ao final.</w:t>
+        <w:t>Este documento orienta você a configurar as contas e gerar as credenciais necessárias para o funcionamento do bot. Siga cada etapa na ordem indicada e envie os dados ao seu desenvolvedor ao final.</w:t>
       </w:r>
     </w:p>
     <w:p/>
@@ -21,12 +21,12 @@
         <w:pStyle w:val="Heading1"/>
       </w:pPr>
       <w:r>
-        <w:t>Parte 1 - OpenAI (Inteligencia Artificial do Bot)</w:t>
+        <w:t>Parte 1 — OpenAI (Inteligência Artificial do Bot)</w:t>
       </w:r>
     </w:p>
     <w:p>
       <w:r>
-        <w:t>O bot utiliza a inteligencia artificial da OpenAI (ChatGPT) para entender e responder as mensagens dos seus pacientes. Voce precisara criar uma conta e adicionar um metodo de pagamento. A cobranca e por uso - em clinicas de pequeno e medio porte o custo mensal costuma ficar entre R$ 10 e R$ 50.</w:t>
+        <w:t>O bot utiliza a inteligência artificial da OpenAI (ChatGPT) para entender e responder as mensagens dos seus pacientes. Você precisará criar uma conta e adicionar crédito de pagamento. A cobrança é por uso — em clínicas de pequeno e médio porte o custo mensal costuma ficar entre R$ 10 e R$ 50.</w:t>
       </w:r>
     </w:p>
     <w:p>
@@ -50,15 +50,13 @@
     </w:p>
     <w:p>
       <w:pPr>
-        <w:jc w:val="center"/>
+        <w:pStyle w:val="ListNumber"/>
       </w:pPr>
       <w:r>
         <w:rPr>
-          <w:i/>
-          <w:color w:val="888888"/>
-          <w:sz w:val="20"/>
+          <w:sz w:val="22"/>
         </w:rPr>
-        <w:t>[ Imagem: Tela inicial do site platform.openai.com com o botao Sign up destacado ]</w:t>
+        <w:t>Cadastre-se com seu e-mail ou conta Google e confirme o e-mail recebido.</w:t>
       </w:r>
     </w:p>
     <w:p>
@@ -69,7 +67,7 @@
         <w:rPr>
           <w:sz w:val="22"/>
         </w:rPr>
-        <w:t>Cadastre-se com seu e-mail ou conta Google.</w:t>
+        <w:t>Após o login, você verá o painel da plataforma (imagem abaixo).</w:t>
       </w:r>
     </w:p>
     <w:p>
@@ -77,12 +75,46 @@
         <w:jc w:val="center"/>
       </w:pPr>
       <w:r>
-        <w:rPr>
-          <w:i/>
-          <w:color w:val="888888"/>
-          <w:sz w:val="20"/>
-        </w:rPr>
-        <w:t>[ Imagem: Formulario de cadastro com campos de e-mail e senha ]</w:t>
+        <w:drawing>
+          <wp:inline xmlns:a="http://schemas.openxmlformats.org/drawingml/2006/main" xmlns:pic="http://schemas.openxmlformats.org/drawingml/2006/picture">
+            <wp:extent cx="5029200" cy="2257842"/>
+            <wp:docPr id="1" name="Picture 1"/>
+            <wp:cNvGraphicFramePr>
+              <a:graphicFrameLocks noChangeAspect="1"/>
+            </wp:cNvGraphicFramePr>
+            <a:graphic>
+              <a:graphicData uri="http://schemas.openxmlformats.org/drawingml/2006/picture">
+                <pic:pic>
+                  <pic:nvPicPr>
+                    <pic:cNvPr id="0" name="landing_page_openai.png"/>
+                    <pic:cNvPicPr/>
+                  </pic:nvPicPr>
+                  <pic:blipFill>
+                    <a:blip r:embed="rId9"/>
+                    <a:stretch>
+                      <a:fillRect/>
+                    </a:stretch>
+                  </pic:blipFill>
+                  <pic:spPr>
+                    <a:xfrm>
+                      <a:off x="0" y="0"/>
+                      <a:ext cx="5029200" cy="2257842"/>
+                    </a:xfrm>
+                    <a:prstGeom prst="rect"/>
+                  </pic:spPr>
+                </pic:pic>
+              </a:graphicData>
+            </a:graphic>
+          </wp:inline>
+        </w:drawing>
+      </w:r>
+    </w:p>
+    <w:p>
+      <w:pPr>
+        <w:pStyle w:val="Heading2"/>
+      </w:pPr>
+      <w:r>
+        <w:t>1.2  Adicionar crédito de pagamento</w:t>
       </w:r>
     </w:p>
     <w:p>
@@ -93,28 +125,7 @@
         <w:rPr>
           <w:sz w:val="22"/>
         </w:rPr>
-        <w:t>Confirme o e-mail recebido na sua caixa de entrada.</w:t>
-      </w:r>
-    </w:p>
-    <w:p>
-      <w:pPr>
-        <w:jc w:val="center"/>
-      </w:pPr>
-      <w:r>
-        <w:rPr>
-          <w:i/>
-          <w:color w:val="888888"/>
-          <w:sz w:val="20"/>
-        </w:rPr>
-        <w:t>[ Imagem: E-mail de confirmacao da OpenAI na caixa de entrada ]</w:t>
-      </w:r>
-    </w:p>
-    <w:p>
-      <w:pPr>
-        <w:pStyle w:val="Heading2"/>
-      </w:pPr>
-      <w:r>
-        <w:t>1.2  Adicionar metodo de pagamento</w:t>
+        <w:t>No menu lateral esquerdo, clique em "Billing".</w:t>
       </w:r>
     </w:p>
     <w:p>
@@ -125,20 +136,7 @@
         <w:rPr>
           <w:sz w:val="22"/>
         </w:rPr>
-        <w:t>Apos o login, clique no seu nome (canto superior direito) e selecione "Billing".</w:t>
-      </w:r>
-    </w:p>
-    <w:p>
-      <w:pPr>
-        <w:jc w:val="center"/>
-      </w:pPr>
-      <w:r>
-        <w:rPr>
-          <w:i/>
-          <w:color w:val="888888"/>
-          <w:sz w:val="20"/>
-        </w:rPr>
-        <w:t>[ Imagem: Menu do usuario aberto com a opcao Billing destacada ]</w:t>
+        <w:t>Clique em "Add to credit balance" e informe os dados do cartão de crédito.</w:t>
       </w:r>
     </w:p>
     <w:p>
@@ -149,7 +147,7 @@
         <w:rPr>
           <w:sz w:val="22"/>
         </w:rPr>
-        <w:t>Clique em "Add payment method" e informe os dados do cartao de credito.</w:t>
+        <w:t>Para controlar o gasto, clique em "Usage limits" e defina um limite mensal (sugestão: R$ 100).</w:t>
       </w:r>
     </w:p>
     <w:p>
@@ -157,36 +155,38 @@
         <w:jc w:val="center"/>
       </w:pPr>
       <w:r>
-        <w:rPr>
-          <w:i/>
-          <w:color w:val="888888"/>
-          <w:sz w:val="20"/>
-        </w:rPr>
-        <w:t>[ Imagem: Tela de Billing com o botao Add payment method ]</w:t>
-      </w:r>
-    </w:p>
-    <w:p>
-      <w:pPr>
-        <w:pStyle w:val="ListNumber"/>
-      </w:pPr>
-      <w:r>
-        <w:rPr>
-          <w:sz w:val="22"/>
-        </w:rPr>
-        <w:t>Defina um limite de gasto mensal em "Usage limits" para evitar surpresas (sugestao: R$ 100).</w:t>
-      </w:r>
-    </w:p>
-    <w:p>
-      <w:pPr>
-        <w:jc w:val="center"/>
-      </w:pPr>
-      <w:r>
-        <w:rPr>
-          <w:i/>
-          <w:color w:val="888888"/>
-          <w:sz w:val="20"/>
-        </w:rPr>
-        <w:t>[ Imagem: Tela de Usage limits com campo de valor preenchido ]</w:t>
+        <w:drawing>
+          <wp:inline xmlns:a="http://schemas.openxmlformats.org/drawingml/2006/main" xmlns:pic="http://schemas.openxmlformats.org/drawingml/2006/picture">
+            <wp:extent cx="5029200" cy="2561815"/>
+            <wp:docPr id="2" name="Picture 2"/>
+            <wp:cNvGraphicFramePr>
+              <a:graphicFrameLocks noChangeAspect="1"/>
+            </wp:cNvGraphicFramePr>
+            <a:graphic>
+              <a:graphicData uri="http://schemas.openxmlformats.org/drawingml/2006/picture">
+                <pic:pic>
+                  <pic:nvPicPr>
+                    <pic:cNvPr id="0" name="add_credits_openai.png"/>
+                    <pic:cNvPicPr/>
+                  </pic:nvPicPr>
+                  <pic:blipFill>
+                    <a:blip r:embed="rId10"/>
+                    <a:stretch>
+                      <a:fillRect/>
+                    </a:stretch>
+                  </pic:blipFill>
+                  <pic:spPr>
+                    <a:xfrm>
+                      <a:off x="0" y="0"/>
+                      <a:ext cx="5029200" cy="2561815"/>
+                    </a:xfrm>
+                    <a:prstGeom prst="rect"/>
+                  </pic:spPr>
+                </pic:pic>
+              </a:graphicData>
+            </a:graphic>
+          </wp:inline>
+        </w:drawing>
       </w:r>
     </w:p>
     <w:p>
@@ -210,15 +210,52 @@
     </w:p>
     <w:p>
       <w:pPr>
+        <w:pStyle w:val="ListNumber"/>
+      </w:pPr>
+      <w:r>
+        <w:rPr>
+          <w:sz w:val="22"/>
+        </w:rPr>
+        <w:t>Clique em "+ Create new secret key", dê um nome (ex.: "bot-clinica") e clique em "Create".</w:t>
+      </w:r>
+    </w:p>
+    <w:p>
+      <w:pPr>
         <w:jc w:val="center"/>
       </w:pPr>
       <w:r>
-        <w:rPr>
-          <w:i/>
-          <w:color w:val="888888"/>
-          <w:sz w:val="20"/>
-        </w:rPr>
-        <w:t>[ Imagem: Menu lateral da plataforma OpenAI com API keys selecionado ]</w:t>
+        <w:drawing>
+          <wp:inline xmlns:a="http://schemas.openxmlformats.org/drawingml/2006/main" xmlns:pic="http://schemas.openxmlformats.org/drawingml/2006/picture">
+            <wp:extent cx="5029200" cy="1869621"/>
+            <wp:docPr id="3" name="Picture 3"/>
+            <wp:cNvGraphicFramePr>
+              <a:graphicFrameLocks noChangeAspect="1"/>
+            </wp:cNvGraphicFramePr>
+            <a:graphic>
+              <a:graphicData uri="http://schemas.openxmlformats.org/drawingml/2006/picture">
+                <pic:pic>
+                  <pic:nvPicPr>
+                    <pic:cNvPr id="0" name="api_key_openai.png"/>
+                    <pic:cNvPicPr/>
+                  </pic:nvPicPr>
+                  <pic:blipFill>
+                    <a:blip r:embed="rId11"/>
+                    <a:stretch>
+                      <a:fillRect/>
+                    </a:stretch>
+                  </pic:blipFill>
+                  <pic:spPr>
+                    <a:xfrm>
+                      <a:off x="0" y="0"/>
+                      <a:ext cx="5029200" cy="1869621"/>
+                    </a:xfrm>
+                    <a:prstGeom prst="rect"/>
+                  </pic:spPr>
+                </pic:pic>
+              </a:graphicData>
+            </a:graphic>
+          </wp:inline>
+        </w:drawing>
       </w:r>
     </w:p>
     <w:p>
@@ -229,7 +266,7 @@
         <w:rPr>
           <w:sz w:val="22"/>
         </w:rPr>
-        <w:t>Clique em "Create new secret key", de um nome (ex.: "bot-clinica") e clique em "Create".</w:t>
+        <w:t>Copie a chave exibida (começa com "sk-..."). Ela só é exibida uma vez.</w:t>
       </w:r>
     </w:p>
     <w:p>
@@ -242,31 +279,7 @@
           <w:color w:val="888888"/>
           <w:sz w:val="20"/>
         </w:rPr>
-        <w:t>[ Imagem: Modal de criacao de chave com campo de nome preenchido e botao Create ]</w:t>
-      </w:r>
-    </w:p>
-    <w:p>
-      <w:pPr>
-        <w:pStyle w:val="ListNumber"/>
-      </w:pPr>
-      <w:r>
-        <w:rPr>
-          <w:sz w:val="22"/>
-        </w:rPr>
-        <w:t>Copie a chave exibida (comeca com "sk-..."). Ela so e exibida uma vez.</w:t>
-      </w:r>
-    </w:p>
-    <w:p>
-      <w:pPr>
-        <w:jc w:val="center"/>
-      </w:pPr>
-      <w:r>
-        <w:rPr>
-          <w:i/>
-          <w:color w:val="888888"/>
-          <w:sz w:val="20"/>
-        </w:rPr>
-        <w:t>[ Imagem: Chave gerada exibida na tela com botao de copiar destacado ]</w:t>
+        <w:t>[ Imagem: Chave gerada exibida na tela com botão de copiar destacado ]</w:t>
       </w:r>
     </w:p>
     <w:p>
@@ -276,13 +289,13 @@
           <w:color w:val="CC6600"/>
           <w:sz w:val="20"/>
         </w:rPr>
-        <w:t>ATENCAO: Guarde essa chave em local seguro. Nao compartilhe publicamente.</w:t>
+        <w:t>ATENÇÃO: Guarde essa chave em local seguro. Não compartilhe publicamente.</w:t>
       </w:r>
     </w:p>
     <w:p/>
     <w:p>
       <w:r>
-        <w:t>DADO NECESSARIO: a chave sk-... gerada no passo 1.3.</w:t>
+        <w:t>DADO NECESSÁRIO: a chave sk-... gerada no passo 1.3.</w:t>
       </w:r>
     </w:p>
     <w:p>
@@ -295,12 +308,12 @@
         <w:pStyle w:val="Heading1"/>
       </w:pPr>
       <w:r>
-        <w:t>Parte 2 - Z-API (Canal WhatsApp)</w:t>
+        <w:t>Parte 2 — Z-API (Canal WhatsApp)</w:t>
       </w:r>
     </w:p>
     <w:p>
       <w:r>
-        <w:t>O Z-API conecta o bot ao seu numero de WhatsApp sem precisar de aprovacao da Meta. Voce usara o numero de telefone da sua clinica - o mesmo chip que deseja usar para atendimento. O plano e pago mensalmente direto no site do Z-API.</w:t>
+        <w:t>O Z-API conecta o bot ao seu número de WhatsApp sem precisar de aprovação da Meta. Você usará o número de telefone da sua clínica — o mesmo chip que deseja usar para atendimento. O plano é pago mensalmente direto no site do Z-API.</w:t>
       </w:r>
     </w:p>
     <w:p>
@@ -310,7 +323,7 @@
           <w:color w:val="CC6600"/>
           <w:sz w:val="20"/>
         </w:rPr>
-        <w:t>ATENCAO: Use um numero que NAO esteja cadastrado como WhatsApp pessoal. O ideal e um chip dedicado ao atendimento da clinica.</w:t>
+        <w:t>ATENÇÃO: Use um número que NÃO esteja cadastrado como WhatsApp pessoal. O ideal é um chip dedicado ao atendimento da clínica.</w:t>
       </w:r>
     </w:p>
     <w:p>
@@ -329,7 +342,7 @@
         <w:rPr>
           <w:sz w:val="22"/>
         </w:rPr>
-        <w:t>Acesse z-api.io e clique em "Criar conta gratis".</w:t>
+        <w:t>Acesse z-api.io e clique em "Criar conta grátis".</w:t>
       </w:r>
     </w:p>
     <w:p>
@@ -337,12 +350,38 @@
         <w:jc w:val="center"/>
       </w:pPr>
       <w:r>
-        <w:rPr>
-          <w:i/>
-          <w:color w:val="888888"/>
-          <w:sz w:val="20"/>
-        </w:rPr>
-        <w:t>[ Imagem: Pagina inicial do z-api.io com botao Criar conta gratis destacado ]</w:t>
+        <w:drawing>
+          <wp:inline xmlns:a="http://schemas.openxmlformats.org/drawingml/2006/main" xmlns:pic="http://schemas.openxmlformats.org/drawingml/2006/picture">
+            <wp:extent cx="5029200" cy="3143250"/>
+            <wp:docPr id="4" name="Picture 4"/>
+            <wp:cNvGraphicFramePr>
+              <a:graphicFrameLocks noChangeAspect="1"/>
+            </wp:cNvGraphicFramePr>
+            <a:graphic>
+              <a:graphicData uri="http://schemas.openxmlformats.org/drawingml/2006/picture">
+                <pic:pic>
+                  <pic:nvPicPr>
+                    <pic:cNvPr id="0" name="zapi_01_landing.png"/>
+                    <pic:cNvPicPr/>
+                  </pic:nvPicPr>
+                  <pic:blipFill>
+                    <a:blip r:embed="rId12"/>
+                    <a:stretch>
+                      <a:fillRect/>
+                    </a:stretch>
+                  </pic:blipFill>
+                  <pic:spPr>
+                    <a:xfrm>
+                      <a:off x="0" y="0"/>
+                      <a:ext cx="5029200" cy="3143250"/>
+                    </a:xfrm>
+                    <a:prstGeom prst="rect"/>
+                  </pic:spPr>
+                </pic:pic>
+              </a:graphicData>
+            </a:graphic>
+          </wp:inline>
+        </w:drawing>
       </w:r>
     </w:p>
     <w:p>
@@ -361,12 +400,38 @@
         <w:jc w:val="center"/>
       </w:pPr>
       <w:r>
-        <w:rPr>
-          <w:i/>
-          <w:color w:val="888888"/>
-          <w:sz w:val="20"/>
-        </w:rPr>
-        <w:t>[ Imagem: Formulario de cadastro do Z-API preenchido ]</w:t>
+        <w:drawing>
+          <wp:inline xmlns:a="http://schemas.openxmlformats.org/drawingml/2006/main" xmlns:pic="http://schemas.openxmlformats.org/drawingml/2006/picture">
+            <wp:extent cx="5029200" cy="3143250"/>
+            <wp:docPr id="5" name="Picture 5"/>
+            <wp:cNvGraphicFramePr>
+              <a:graphicFrameLocks noChangeAspect="1"/>
+            </wp:cNvGraphicFramePr>
+            <a:graphic>
+              <a:graphicData uri="http://schemas.openxmlformats.org/drawingml/2006/picture">
+                <pic:pic>
+                  <pic:nvPicPr>
+                    <pic:cNvPr id="0" name="zapi_02_signup.png"/>
+                    <pic:cNvPicPr/>
+                  </pic:nvPicPr>
+                  <pic:blipFill>
+                    <a:blip r:embed="rId13"/>
+                    <a:stretch>
+                      <a:fillRect/>
+                    </a:stretch>
+                  </pic:blipFill>
+                  <pic:spPr>
+                    <a:xfrm>
+                      <a:off x="0" y="0"/>
+                      <a:ext cx="5029200" cy="3143250"/>
+                    </a:xfrm>
+                    <a:prstGeom prst="rect"/>
+                  </pic:spPr>
+                </pic:pic>
+              </a:graphicData>
+            </a:graphic>
+          </wp:inline>
+        </w:drawing>
       </w:r>
     </w:p>
     <w:p>
@@ -374,12 +439,12 @@
         <w:pStyle w:val="Heading2"/>
       </w:pPr>
       <w:r>
-        <w:t>2.2  Criar uma instancia</w:t>
+        <w:t>2.2  Criar uma instância</w:t>
       </w:r>
     </w:p>
     <w:p>
       <w:r>
-        <w:t>Cada instancia equivale a uma conexao WhatsApp. Para a clinica, voce precisara de uma instancia.</w:t>
+        <w:t>Cada instância equivale a uma conexão WhatsApp. Para a clínica, você precisará de uma instância.</w:t>
       </w:r>
     </w:p>
     <w:p>
@@ -390,7 +455,7 @@
         <w:rPr>
           <w:sz w:val="22"/>
         </w:rPr>
-        <w:t>No painel, clique em "Nova instancia".</w:t>
+        <w:t>No painel, clique em "Nova instância".</w:t>
       </w:r>
     </w:p>
     <w:p>
@@ -403,7 +468,7 @@
           <w:color w:val="888888"/>
           <w:sz w:val="20"/>
         </w:rPr>
-        <w:t>[ Imagem: Painel do Z-API com botao Nova instancia destacado ]</w:t>
+        <w:t>[ Imagem: Painel do Z-API com botão Nova instância destacado ]</w:t>
       </w:r>
     </w:p>
     <w:p>
@@ -414,7 +479,7 @@
         <w:rPr>
           <w:sz w:val="22"/>
         </w:rPr>
-        <w:t>De um nome a instancia (ex.: "clinica-exames") e confirme.</w:t>
+        <w:t>Dê um nome à instância (ex.: "clinica-exames") e confirme.</w:t>
       </w:r>
     </w:p>
     <w:p>
@@ -427,7 +492,7 @@
           <w:color w:val="888888"/>
           <w:sz w:val="20"/>
         </w:rPr>
-        <w:t>[ Imagem: Modal de criacao de instancia com campo de nome preenchido ]</w:t>
+        <w:t>[ Imagem: Modal de criação de instância com campo de nome preenchido ]</w:t>
       </w:r>
     </w:p>
     <w:p>
@@ -451,7 +516,7 @@
           <w:color w:val="888888"/>
           <w:sz w:val="20"/>
         </w:rPr>
-        <w:t>[ Imagem: Tela de selecao de plano do Z-API ]</w:t>
+        <w:t>[ Imagem: Tela de seleção de plano do Z-API ]</w:t>
       </w:r>
     </w:p>
     <w:p>
@@ -459,7 +524,7 @@
         <w:pStyle w:val="Heading2"/>
       </w:pPr>
       <w:r>
-        <w:t>2.3  Conectar o numero de WhatsApp (QR Code)</w:t>
+        <w:t>2.3  Conectar o número de WhatsApp (QR Code)</w:t>
       </w:r>
     </w:p>
     <w:p>
@@ -470,7 +535,7 @@
         <w:rPr>
           <w:sz w:val="22"/>
         </w:rPr>
-        <w:t>Abra a instancia criada e clique em "Conectar".</w:t>
+        <w:t>Abra a instância criada e clique em "Conectar".</w:t>
       </w:r>
     </w:p>
     <w:p>
@@ -483,7 +548,7 @@
           <w:color w:val="888888"/>
           <w:sz w:val="20"/>
         </w:rPr>
-        <w:t>[ Imagem: Tela da instancia com botao Conectar e QR Code exibido ]</w:t>
+        <w:t>[ Imagem: Tela da instância com botão Conectar e QR Code exibido ]</w:t>
       </w:r>
     </w:p>
     <w:p>
@@ -494,7 +559,7 @@
         <w:rPr>
           <w:sz w:val="22"/>
         </w:rPr>
-        <w:t>No celular da clinica, abra o WhatsApp -&gt; Menu (tres pontos) -&gt; "Dispositivos vinculados" -&gt; "Vincular dispositivo".</w:t>
+        <w:t>No celular da clínica, abra o WhatsApp → Menu (três pontos) → "Dispositivos vinculados" → "Vincular dispositivo".</w:t>
       </w:r>
     </w:p>
     <w:p>
@@ -507,7 +572,7 @@
           <w:color w:val="888888"/>
           <w:sz w:val="20"/>
         </w:rPr>
-        <w:t>[ Imagem: Tela do WhatsApp no celular com a opcao Dispositivos vinculados aberta ]</w:t>
+        <w:t>[ Imagem: Tela do WhatsApp no celular com a opção Dispositivos vinculados aberta ]</w:t>
       </w:r>
     </w:p>
     <w:p>
@@ -518,7 +583,7 @@
         <w:rPr>
           <w:sz w:val="22"/>
         </w:rPr>
-        <w:t>Aponte a camera para o QR Code exibido no Z-API. A instancia ficara com status "Conectado".</w:t>
+        <w:t>Aponte a câmera para o QR Code exibido no Z-API. A instância ficará com status "Conectado".</w:t>
       </w:r>
     </w:p>
     <w:p>
@@ -531,7 +596,7 @@
           <w:color w:val="888888"/>
           <w:sz w:val="20"/>
         </w:rPr>
-        <w:t>[ Imagem: Status da instancia no Z-API exibindo Conectado com icone verde ]</w:t>
+        <w:t>[ Imagem: Status da instância no Z-API exibindo Conectado com ícone verde ]</w:t>
       </w:r>
     </w:p>
     <w:p>
@@ -544,7 +609,7 @@
     </w:p>
     <w:p>
       <w:r>
-        <w:t>Voce precisara de tres informacoes dentro da instancia:</w:t>
+        <w:t>Você precisará de três informações dentro da instância:</w:t>
       </w:r>
     </w:p>
     <w:p>
@@ -555,7 +620,7 @@
         <w:rPr>
           <w:sz w:val="22"/>
         </w:rPr>
-        <w:t>Instance ID - exibido no topo da pagina da instancia.</w:t>
+        <w:t>Instance ID — exibido no topo da página da instância.</w:t>
       </w:r>
     </w:p>
     <w:p>
@@ -568,7 +633,7 @@
           <w:color w:val="888888"/>
           <w:sz w:val="20"/>
         </w:rPr>
-        <w:t>[ Imagem: Tela da instancia com o campo Instance ID destacado ]</w:t>
+        <w:t>[ Imagem: Tela da instância com o campo Instance ID destacado ]</w:t>
       </w:r>
     </w:p>
     <w:p>
@@ -579,7 +644,7 @@
         <w:rPr>
           <w:sz w:val="22"/>
         </w:rPr>
-        <w:t>Token - exibido logo abaixo do Instance ID.</w:t>
+        <w:t>Token — exibido logo abaixo do Instance ID.</w:t>
       </w:r>
     </w:p>
     <w:p>
@@ -592,7 +657,7 @@
           <w:color w:val="888888"/>
           <w:sz w:val="20"/>
         </w:rPr>
-        <w:t>[ Imagem: Tela da instancia com o campo Token destacado ]</w:t>
+        <w:t>[ Imagem: Tela da instância com o campo Token destacado ]</w:t>
       </w:r>
     </w:p>
     <w:p>
@@ -603,7 +668,7 @@
         <w:rPr>
           <w:sz w:val="22"/>
         </w:rPr>
-        <w:t>Client Token (Security Token) - acesse a aba "Security" dentro da instancia e copie o valor exibido.</w:t>
+        <w:t>Client Token (Security Token) — acesse a aba "Security" dentro da instância e copie o valor exibido.</w:t>
       </w:r>
     </w:p>
     <w:p>
@@ -616,13 +681,13 @@
           <w:color w:val="888888"/>
           <w:sz w:val="20"/>
         </w:rPr>
-        <w:t>[ Imagem: Aba Security da instancia com o campo Client Token destacado ]</w:t>
+        <w:t>[ Imagem: Aba Security da instância com o campo Client Token destacado ]</w:t>
       </w:r>
     </w:p>
     <w:p/>
     <w:p>
       <w:r>
-        <w:t>DADOS NECESSARIOS: Instance ID, Token e Client Token copiados no passo 2.4.</w:t>
+        <w:t>DADOS NECESSÁRIOS: Instance ID, Token e Client Token copiados no passo 2.4.</w:t>
       </w:r>
     </w:p>
     <w:p>
@@ -635,12 +700,12 @@
         <w:pStyle w:val="Heading1"/>
       </w:pPr>
       <w:r>
-        <w:t>Parte 3 - Enviar as credenciais ao desenvolvedor</w:t>
+        <w:t>Parte 3 — Enviar as credenciais ao desenvolvedor</w:t>
       </w:r>
     </w:p>
     <w:p>
       <w:r>
-        <w:t>Com os dados abaixo em maos, envie-os ao seu desenvolvedor pelo canal combinado (WhatsApp, e-mail ou formulario seguro). Nao publique essas informacoes em grupos ou redes sociais.</w:t>
+        <w:t>Com os dados abaixo em mãos, envie-os ao seu desenvolvedor pelo canal combinado (WhatsApp, e-mail ou formulário seguro). Não publique essas informações em grupos ou redes sociais.</w:t>
       </w:r>
     </w:p>
     <w:p/>
@@ -773,7 +838,7 @@
           <w:color w:val="CC6600"/>
           <w:sz w:val="20"/>
         </w:rPr>
-        <w:t>ATENCAO: Apos o desenvolvedor confirmar a configuracao, voce pode descartar este documento ou guarda-lo em local seguro offline.</w:t>
+        <w:t>ATENÇÃO: Após o desenvolvedor confirmar a configuração, você pode descartar este documento ou guardá-lo em local seguro offline.</w:t>
       </w:r>
     </w:p>
     <w:p>
@@ -786,7 +851,7 @@
         <w:pStyle w:val="Heading1"/>
       </w:pPr>
       <w:r>
-        <w:t>Resumo - O que cada servico faz</w:t>
+        <w:t>Resumo — O que cada serviço faz</w:t>
       </w:r>
     </w:p>
     <w:tbl>
@@ -810,7 +875,7 @@
               <w:rPr>
                 <w:b/>
               </w:rPr>
-              <w:t>Servico</w:t>
+              <w:t>Serviço</w:t>
             </w:r>
           </w:p>
         </w:tc>
@@ -823,7 +888,7 @@
               <w:rPr>
                 <w:b/>
               </w:rPr>
-              <w:t>Funcao</w:t>
+              <w:t>Função</w:t>
             </w:r>
           </w:p>
         </w:tc>
@@ -858,7 +923,7 @@
           </w:tcPr>
           <w:p>
             <w:r>
-              <w:t>Inteligencia do bot (entende e responde mensagens)</w:t>
+              <w:t>Inteligência do bot (entende e responde mensagens)</w:t>
             </w:r>
           </w:p>
         </w:tc>
@@ -868,7 +933,7 @@
           </w:tcPr>
           <w:p>
             <w:r>
-              <w:t>Voce (cliente)</w:t>
+              <w:t>Você (cliente)</w:t>
             </w:r>
           </w:p>
         </w:tc>
@@ -890,7 +955,7 @@
           </w:tcPr>
           <w:p>
             <w:r>
-              <w:t>Conexao com seu numero de WhatsApp</w:t>
+              <w:t>Conexão com seu número de WhatsApp</w:t>
             </w:r>
           </w:p>
         </w:tc>
@@ -900,7 +965,7 @@
           </w:tcPr>
           <w:p>
             <w:r>
-              <w:t>Voce (cliente)</w:t>
+              <w:t>Você (cliente)</w:t>
             </w:r>
           </w:p>
         </w:tc>
@@ -941,7 +1006,7 @@
     <w:p/>
     <w:p>
       <w:r>
-        <w:t>Duvidas? Entre em contato com seu desenvolvedor.</w:t>
+        <w:t>Dúvidas? Entre em contato com seu desenvolvedor.</w:t>
       </w:r>
     </w:p>
     <w:sectPr>

</xml_diff>